<commit_message>
Docs: add v2.6.2 stabilization changes (12-18) to the ECG changes document
</commit_message>
<xml_diff>
--- a/OpenVetSim_ECG_Changes_July2026.docx
+++ b/OpenVetSim_ECG_Changes_July2026.docx
@@ -53,7 +53,7 @@
         <w:spacing w:after="120"/>
       </w:pPr>
       <w:r>
-        <w:t xml:space="preserve">This document summarizes seven changes made to OpenVetSim in July 2026: four improvements to the ECG engine and three changes that add selectable ETCO₂ capnogram waveform types. The ECG changes span the C++ simulation binary (pulse.cpp) and the JavaScript front-end (sim-ii/js/chart.js). The ETCO₂ changes span the C++ shared-memory layer, the JavaScript rendering engine, and the instructor UI. The goal in each case was to improve clinical realism.</w:t>
+        <w:t xml:space="preserve">This document summarizes the code changes made to OpenVetSim in July 2026. Changes 1–11 cover the ECG-engine improvements, the selectable ETCO₂ capnogram waveform types, the mobile remote-control interface, the controller-disconnect indicator, and the heart-beat timing fix. Changes 12–18 cover the v2.6.2 stabilization work: scenario-loading robustness, the Windows startup crash fixes, controller-connection hardening, and installer and configuration improvements. The ECG changes span the C++ simulation binary (pulse.cpp) and the JavaScript front-end (sim-ii/js/chart.js). The ETCO₂ changes span the C++ shared-memory layer, the JavaScript rendering engine, and the instructor UI. The goal in each case was to improve clinical realism.</w:t>
       </w:r>
     </w:p>
     <w:p>
@@ -1370,6 +1370,846 @@
           </w:p>
         </w:tc>
       </w:tr>
+      <w:tr>
+        <w:trPr>
+          <w:cantSplit/>
+        </w:trPr>
+        <w:tc>
+          <w:tcPr>
+            <w:tcW w:type="dxa" w:w="2500"/>
+            <w:tcBorders>
+              <w:top w:val="single" w:color="CCCCCC" w:sz="1"/>
+              <w:left w:val="single" w:color="CCCCCC" w:sz="1"/>
+              <w:bottom w:val="single" w:color="CCCCCC" w:sz="1"/>
+              <w:right w:val="single" w:color="CCCCCC" w:sz="1"/>
+            </w:tcBorders>
+            <w:shd w:fill="D6E4F0" w:val="clear"/>
+            <w:tcMar>
+              <w:top w:type="dxa" w:w="80"/>
+              <w:left w:type="dxa" w:w="120"/>
+              <w:bottom w:type="dxa" w:w="80"/>
+              <w:right w:type="dxa" w:w="120"/>
+            </w:tcMar>
+          </w:tcPr>
+          <w:p>
+            <w:r>
+              <w:rPr>
+                <w:b/>
+                <w:bCs/>
+                <w:sz w:val="20"/>
+                <w:szCs w:val="20"/>
+              </w:rPr>
+              <w:t xml:space="preserve">Files</w:t>
+            </w:r>
+          </w:p>
+        </w:tc>
+        <w:tc>
+          <w:tcPr>
+            <w:tcW w:type="dxa" w:w="6860"/>
+            <w:tcBorders>
+              <w:top w:val="single" w:color="CCCCCC" w:sz="1"/>
+              <w:left w:val="single" w:color="CCCCCC" w:sz="1"/>
+              <w:bottom w:val="single" w:color="CCCCCC" w:sz="1"/>
+              <w:right w:val="single" w:color="CCCCCC" w:sz="1"/>
+            </w:tcBorders>
+            <w:tcMar>
+              <w:top w:type="dxa" w:w="80"/>
+              <w:left w:type="dxa" w:w="120"/>
+              <w:bottom w:type="dxa" w:w="80"/>
+              <w:right w:type="dxa" w:w="120"/>
+            </w:tcMar>
+          </w:tcPr>
+          <w:p>
+            <w:r>
+              <w:rPr>
+                <w:sz w:val="20"/>
+                <w:szCs w:val="20"/>
+              </w:rPr>
+              <w:t xml:space="preserve">scenarioXML.class.php (sim-ii + sim-player), ajaxGetScenario.php, scenario.js, profile.js</w:t>
+            </w:r>
+          </w:p>
+        </w:tc>
+      </w:tr>
+      <w:tr>
+        <w:trPr>
+          <w:cantSplit/>
+        </w:trPr>
+        <w:tc>
+          <w:tcPr>
+            <w:tcW w:type="dxa" w:w="2500"/>
+            <w:tcBorders>
+              <w:top w:val="single" w:color="CCCCCC" w:sz="1"/>
+              <w:left w:val="single" w:color="CCCCCC" w:sz="1"/>
+              <w:bottom w:val="single" w:color="CCCCCC" w:sz="1"/>
+              <w:right w:val="single" w:color="CCCCCC" w:sz="1"/>
+            </w:tcBorders>
+            <w:shd w:fill="EBF3FB" w:val="clear"/>
+            <w:tcMar>
+              <w:top w:type="dxa" w:w="80"/>
+              <w:left w:type="dxa" w:w="120"/>
+              <w:bottom w:type="dxa" w:w="80"/>
+              <w:right w:type="dxa" w:w="120"/>
+            </w:tcMar>
+          </w:tcPr>
+          <w:p>
+            <w:r>
+              <w:rPr>
+                <w:b/>
+                <w:bCs/>
+                <w:sz w:val="20"/>
+                <w:szCs w:val="20"/>
+              </w:rPr>
+              <w:t xml:space="preserve">Change 12</w:t>
+            </w:r>
+          </w:p>
+        </w:tc>
+        <w:tc>
+          <w:tcPr>
+            <w:tcW w:type="dxa" w:w="6860"/>
+            <w:tcBorders>
+              <w:top w:val="single" w:color="CCCCCC" w:sz="1"/>
+              <w:left w:val="single" w:color="CCCCCC" w:sz="1"/>
+              <w:bottom w:val="single" w:color="CCCCCC" w:sz="1"/>
+              <w:right w:val="single" w:color="CCCCCC" w:sz="1"/>
+            </w:tcBorders>
+            <w:tcMar>
+              <w:top w:type="dxa" w:w="80"/>
+              <w:left w:type="dxa" w:w="120"/>
+              <w:bottom w:type="dxa" w:w="80"/>
+              <w:right w:type="dxa" w:w="120"/>
+            </w:tcMar>
+          </w:tcPr>
+          <w:p>
+            <w:r>
+              <w:rPr>
+                <w:sz w:val="20"/>
+                <w:szCs w:val="20"/>
+              </w:rPr>
+              <w:t xml:space="preserve">Scenario-load errors reported instead of failing silently; empty &lt;vocals&gt;/&lt;media&gt; no longer fatal</w:t>
+            </w:r>
+          </w:p>
+        </w:tc>
+      </w:tr>
+      <w:tr>
+        <w:trPr>
+          <w:cantSplit/>
+        </w:trPr>
+        <w:tc>
+          <w:tcPr>
+            <w:tcW w:type="dxa" w:w="2500"/>
+            <w:tcBorders>
+              <w:top w:val="single" w:color="CCCCCC" w:sz="1"/>
+              <w:left w:val="single" w:color="CCCCCC" w:sz="1"/>
+              <w:bottom w:val="single" w:color="CCCCCC" w:sz="1"/>
+              <w:right w:val="single" w:color="CCCCCC" w:sz="1"/>
+            </w:tcBorders>
+            <w:shd w:fill="D6E4F0" w:val="clear"/>
+            <w:tcMar>
+              <w:top w:type="dxa" w:w="80"/>
+              <w:left w:type="dxa" w:w="120"/>
+              <w:bottom w:type="dxa" w:w="80"/>
+              <w:right w:type="dxa" w:w="120"/>
+            </w:tcMar>
+          </w:tcPr>
+          <w:p>
+            <w:r>
+              <w:rPr>
+                <w:b/>
+                <w:bCs/>
+                <w:sz w:val="20"/>
+                <w:szCs w:val="20"/>
+              </w:rPr>
+              <w:t xml:space="preserve">Files</w:t>
+            </w:r>
+          </w:p>
+        </w:tc>
+        <w:tc>
+          <w:tcPr>
+            <w:tcW w:type="dxa" w:w="6860"/>
+            <w:tcBorders>
+              <w:top w:val="single" w:color="CCCCCC" w:sz="1"/>
+              <w:left w:val="single" w:color="CCCCCC" w:sz="1"/>
+              <w:bottom w:val="single" w:color="CCCCCC" w:sz="1"/>
+              <w:right w:val="single" w:color="CCCCCC" w:sz="1"/>
+            </w:tcBorders>
+            <w:tcMar>
+              <w:top w:type="dxa" w:w="80"/>
+              <w:left w:type="dxa" w:w="120"/>
+              <w:bottom w:type="dxa" w:w="80"/>
+              <w:right w:type="dxa" w:w="120"/>
+            </w:tcMar>
+          </w:tcPr>
+          <w:p>
+            <w:r>
+              <w:rPr>
+                <w:sz w:val="20"/>
+                <w:szCs w:val="20"/>
+              </w:rPr>
+              <w:t xml:space="preserve">OpenVetSim/version.h, OpenVetSim/main.cpp, sim-ii/js/modal.js</w:t>
+            </w:r>
+          </w:p>
+        </w:tc>
+      </w:tr>
+      <w:tr>
+        <w:trPr>
+          <w:cantSplit/>
+        </w:trPr>
+        <w:tc>
+          <w:tcPr>
+            <w:tcW w:type="dxa" w:w="2500"/>
+            <w:tcBorders>
+              <w:top w:val="single" w:color="CCCCCC" w:sz="1"/>
+              <w:left w:val="single" w:color="CCCCCC" w:sz="1"/>
+              <w:bottom w:val="single" w:color="CCCCCC" w:sz="1"/>
+              <w:right w:val="single" w:color="CCCCCC" w:sz="1"/>
+            </w:tcBorders>
+            <w:shd w:fill="EBF3FB" w:val="clear"/>
+            <w:tcMar>
+              <w:top w:type="dxa" w:w="80"/>
+              <w:left w:type="dxa" w:w="120"/>
+              <w:bottom w:type="dxa" w:w="80"/>
+              <w:right w:type="dxa" w:w="120"/>
+            </w:tcMar>
+          </w:tcPr>
+          <w:p>
+            <w:r>
+              <w:rPr>
+                <w:b/>
+                <w:bCs/>
+                <w:sz w:val="20"/>
+                <w:szCs w:val="20"/>
+              </w:rPr>
+              <w:t xml:space="preserve">Change 13</w:t>
+            </w:r>
+          </w:p>
+        </w:tc>
+        <w:tc>
+          <w:tcPr>
+            <w:tcW w:type="dxa" w:w="6860"/>
+            <w:tcBorders>
+              <w:top w:val="single" w:color="CCCCCC" w:sz="1"/>
+              <w:left w:val="single" w:color="CCCCCC" w:sz="1"/>
+              <w:bottom w:val="single" w:color="CCCCCC" w:sz="1"/>
+              <w:right w:val="single" w:color="CCCCCC" w:sz="1"/>
+            </w:tcBorders>
+            <w:tcMar>
+              <w:top w:type="dxa" w:w="80"/>
+              <w:left w:type="dxa" w:w="120"/>
+              <w:bottom w:type="dxa" w:w="80"/>
+              <w:right w:type="dxa" w:w="120"/>
+            </w:tcMar>
+          </w:tcPr>
+          <w:p>
+            <w:r>
+              <w:rPr>
+                <w:sz w:val="20"/>
+                <w:szCs w:val="20"/>
+              </w:rPr>
+              <w:t xml:space="preserve">Engine version bumped to 2.6.2; Help → About box updated</w:t>
+            </w:r>
+          </w:p>
+        </w:tc>
+      </w:tr>
+      <w:tr>
+        <w:trPr>
+          <w:cantSplit/>
+        </w:trPr>
+        <w:tc>
+          <w:tcPr>
+            <w:tcW w:type="dxa" w:w="2500"/>
+            <w:tcBorders>
+              <w:top w:val="single" w:color="CCCCCC" w:sz="1"/>
+              <w:left w:val="single" w:color="CCCCCC" w:sz="1"/>
+              <w:bottom w:val="single" w:color="CCCCCC" w:sz="1"/>
+              <w:right w:val="single" w:color="CCCCCC" w:sz="1"/>
+            </w:tcBorders>
+            <w:shd w:fill="D6E4F0" w:val="clear"/>
+            <w:tcMar>
+              <w:top w:type="dxa" w:w="80"/>
+              <w:left w:type="dxa" w:w="120"/>
+              <w:bottom w:type="dxa" w:w="80"/>
+              <w:right w:type="dxa" w:w="120"/>
+            </w:tcMar>
+          </w:tcPr>
+          <w:p>
+            <w:r>
+              <w:rPr>
+                <w:b/>
+                <w:bCs/>
+                <w:sz w:val="20"/>
+                <w:szCs w:val="20"/>
+              </w:rPr>
+              <w:t xml:space="preserve">Files</w:t>
+            </w:r>
+          </w:p>
+        </w:tc>
+        <w:tc>
+          <w:tcPr>
+            <w:tcW w:type="dxa" w:w="6860"/>
+            <w:tcBorders>
+              <w:top w:val="single" w:color="CCCCCC" w:sz="1"/>
+              <w:left w:val="single" w:color="CCCCCC" w:sz="1"/>
+              <w:bottom w:val="single" w:color="CCCCCC" w:sz="1"/>
+              <w:right w:val="single" w:color="CCCCCC" w:sz="1"/>
+            </w:tcBorders>
+            <w:tcMar>
+              <w:top w:type="dxa" w:w="80"/>
+              <w:left w:type="dxa" w:w="120"/>
+              <w:bottom w:type="dxa" w:w="80"/>
+              <w:right w:type="dxa" w:w="120"/>
+            </w:tcMar>
+          </w:tcPr>
+          <w:p>
+            <w:r>
+              <w:rPr>
+                <w:sz w:val="20"/>
+                <w:szCs w:val="20"/>
+              </w:rPr>
+              <w:t xml:space="preserve">OpenVetSim/WebSrv.cpp, OpenVetSim/VetSim.cpp</w:t>
+            </w:r>
+          </w:p>
+        </w:tc>
+      </w:tr>
+      <w:tr>
+        <w:trPr>
+          <w:cantSplit/>
+        </w:trPr>
+        <w:tc>
+          <w:tcPr>
+            <w:tcW w:type="dxa" w:w="2500"/>
+            <w:tcBorders>
+              <w:top w:val="single" w:color="CCCCCC" w:sz="1"/>
+              <w:left w:val="single" w:color="CCCCCC" w:sz="1"/>
+              <w:bottom w:val="single" w:color="CCCCCC" w:sz="1"/>
+              <w:right w:val="single" w:color="CCCCCC" w:sz="1"/>
+            </w:tcBorders>
+            <w:shd w:fill="EBF3FB" w:val="clear"/>
+            <w:tcMar>
+              <w:top w:type="dxa" w:w="80"/>
+              <w:left w:type="dxa" w:w="120"/>
+              <w:bottom w:type="dxa" w:w="80"/>
+              <w:right w:type="dxa" w:w="120"/>
+            </w:tcMar>
+          </w:tcPr>
+          <w:p>
+            <w:r>
+              <w:rPr>
+                <w:b/>
+                <w:bCs/>
+                <w:sz w:val="20"/>
+                <w:szCs w:val="20"/>
+              </w:rPr>
+              <w:t xml:space="preserve">Change 14</w:t>
+            </w:r>
+          </w:p>
+        </w:tc>
+        <w:tc>
+          <w:tcPr>
+            <w:tcW w:type="dxa" w:w="6860"/>
+            <w:tcBorders>
+              <w:top w:val="single" w:color="CCCCCC" w:sz="1"/>
+              <w:left w:val="single" w:color="CCCCCC" w:sz="1"/>
+              <w:bottom w:val="single" w:color="CCCCCC" w:sz="1"/>
+              <w:right w:val="single" w:color="CCCCCC" w:sz="1"/>
+            </w:tcBorders>
+            <w:tcMar>
+              <w:top w:type="dxa" w:w="80"/>
+              <w:left w:type="dxa" w:w="120"/>
+              <w:bottom w:type="dxa" w:w="80"/>
+              <w:right w:type="dxa" w:w="120"/>
+            </w:tcMar>
+          </w:tcPr>
+          <w:p>
+            <w:r>
+              <w:rPr>
+                <w:sz w:val="20"/>
+                <w:szCs w:val="20"/>
+              </w:rPr>
+              <w:t xml:space="preserve">Windows startup crash (blank white screen) fixed</w:t>
+            </w:r>
+          </w:p>
+        </w:tc>
+      </w:tr>
+      <w:tr>
+        <w:trPr>
+          <w:cantSplit/>
+        </w:trPr>
+        <w:tc>
+          <w:tcPr>
+            <w:tcW w:type="dxa" w:w="2500"/>
+            <w:tcBorders>
+              <w:top w:val="single" w:color="CCCCCC" w:sz="1"/>
+              <w:left w:val="single" w:color="CCCCCC" w:sz="1"/>
+              <w:bottom w:val="single" w:color="CCCCCC" w:sz="1"/>
+              <w:right w:val="single" w:color="CCCCCC" w:sz="1"/>
+            </w:tcBorders>
+            <w:shd w:fill="D6E4F0" w:val="clear"/>
+            <w:tcMar>
+              <w:top w:type="dxa" w:w="80"/>
+              <w:left w:type="dxa" w:w="120"/>
+              <w:bottom w:type="dxa" w:w="80"/>
+              <w:right w:type="dxa" w:w="120"/>
+            </w:tcMar>
+          </w:tcPr>
+          <w:p>
+            <w:r>
+              <w:rPr>
+                <w:b/>
+                <w:bCs/>
+                <w:sz w:val="20"/>
+                <w:szCs w:val="20"/>
+              </w:rPr>
+              <w:t xml:space="preserve">File</w:t>
+            </w:r>
+          </w:p>
+        </w:tc>
+        <w:tc>
+          <w:tcPr>
+            <w:tcW w:type="dxa" w:w="6860"/>
+            <w:tcBorders>
+              <w:top w:val="single" w:color="CCCCCC" w:sz="1"/>
+              <w:left w:val="single" w:color="CCCCCC" w:sz="1"/>
+              <w:bottom w:val="single" w:color="CCCCCC" w:sz="1"/>
+              <w:right w:val="single" w:color="CCCCCC" w:sz="1"/>
+            </w:tcBorders>
+            <w:tcMar>
+              <w:top w:type="dxa" w:w="80"/>
+              <w:left w:type="dxa" w:w="120"/>
+              <w:bottom w:type="dxa" w:w="80"/>
+              <w:right w:type="dxa" w:w="120"/>
+            </w:tcMar>
+          </w:tcPr>
+          <w:p>
+            <w:r>
+              <w:rPr>
+                <w:sz w:val="20"/>
+                <w:szCs w:val="20"/>
+              </w:rPr>
+              <w:t xml:space="preserve">OpenVetSim/pulse.cpp</w:t>
+            </w:r>
+          </w:p>
+        </w:tc>
+      </w:tr>
+      <w:tr>
+        <w:trPr>
+          <w:cantSplit/>
+        </w:trPr>
+        <w:tc>
+          <w:tcPr>
+            <w:tcW w:type="dxa" w:w="2500"/>
+            <w:tcBorders>
+              <w:top w:val="single" w:color="CCCCCC" w:sz="1"/>
+              <w:left w:val="single" w:color="CCCCCC" w:sz="1"/>
+              <w:bottom w:val="single" w:color="CCCCCC" w:sz="1"/>
+              <w:right w:val="single" w:color="CCCCCC" w:sz="1"/>
+            </w:tcBorders>
+            <w:shd w:fill="EBF3FB" w:val="clear"/>
+            <w:tcMar>
+              <w:top w:type="dxa" w:w="80"/>
+              <w:left w:type="dxa" w:w="120"/>
+              <w:bottom w:type="dxa" w:w="80"/>
+              <w:right w:type="dxa" w:w="120"/>
+            </w:tcMar>
+          </w:tcPr>
+          <w:p>
+            <w:r>
+              <w:rPr>
+                <w:b/>
+                <w:bCs/>
+                <w:sz w:val="20"/>
+                <w:szCs w:val="20"/>
+              </w:rPr>
+              <w:t xml:space="preserve">Change 15</w:t>
+            </w:r>
+          </w:p>
+        </w:tc>
+        <w:tc>
+          <w:tcPr>
+            <w:tcW w:type="dxa" w:w="6860"/>
+            <w:tcBorders>
+              <w:top w:val="single" w:color="CCCCCC" w:sz="1"/>
+              <w:left w:val="single" w:color="CCCCCC" w:sz="1"/>
+              <w:bottom w:val="single" w:color="CCCCCC" w:sz="1"/>
+              <w:right w:val="single" w:color="CCCCCC" w:sz="1"/>
+            </w:tcBorders>
+            <w:tcMar>
+              <w:top w:type="dxa" w:w="80"/>
+              <w:left w:type="dxa" w:w="120"/>
+              <w:bottom w:type="dxa" w:w="80"/>
+              <w:right w:type="dxa" w:w="120"/>
+            </w:tcMar>
+          </w:tcPr>
+          <w:p>
+            <w:r>
+              <w:rPr>
+                <w:sz w:val="20"/>
+                <w:szCs w:val="20"/>
+              </w:rPr>
+              <w:t xml:space="preserve">Controller-connection hardening — legacy port disabled; firmware-version fetch moved off the accept path</w:t>
+            </w:r>
+          </w:p>
+        </w:tc>
+      </w:tr>
+      <w:tr>
+        <w:trPr>
+          <w:cantSplit/>
+        </w:trPr>
+        <w:tc>
+          <w:tcPr>
+            <w:tcW w:type="dxa" w:w="2500"/>
+            <w:tcBorders>
+              <w:top w:val="single" w:color="CCCCCC" w:sz="1"/>
+              <w:left w:val="single" w:color="CCCCCC" w:sz="1"/>
+              <w:bottom w:val="single" w:color="CCCCCC" w:sz="1"/>
+              <w:right w:val="single" w:color="CCCCCC" w:sz="1"/>
+            </w:tcBorders>
+            <w:shd w:fill="D6E4F0" w:val="clear"/>
+            <w:tcMar>
+              <w:top w:type="dxa" w:w="80"/>
+              <w:left w:type="dxa" w:w="120"/>
+              <w:bottom w:type="dxa" w:w="80"/>
+              <w:right w:type="dxa" w:w="120"/>
+            </w:tcMar>
+          </w:tcPr>
+          <w:p>
+            <w:r>
+              <w:rPr>
+                <w:b/>
+                <w:bCs/>
+                <w:sz w:val="20"/>
+                <w:szCs w:val="20"/>
+              </w:rPr>
+              <w:t xml:space="preserve">File</w:t>
+            </w:r>
+          </w:p>
+        </w:tc>
+        <w:tc>
+          <w:tcPr>
+            <w:tcW w:type="dxa" w:w="6860"/>
+            <w:tcBorders>
+              <w:top w:val="single" w:color="CCCCCC" w:sz="1"/>
+              <w:left w:val="single" w:color="CCCCCC" w:sz="1"/>
+              <w:bottom w:val="single" w:color="CCCCCC" w:sz="1"/>
+              <w:right w:val="single" w:color="CCCCCC" w:sz="1"/>
+            </w:tcBorders>
+            <w:tcMar>
+              <w:top w:type="dxa" w:w="80"/>
+              <w:left w:type="dxa" w:w="120"/>
+              <w:bottom w:type="dxa" w:w="80"/>
+              <w:right w:type="dxa" w:w="120"/>
+            </w:tcMar>
+          </w:tcPr>
+          <w:p>
+            <w:r>
+              <w:rPr>
+                <w:sz w:val="20"/>
+                <w:szCs w:val="20"/>
+              </w:rPr>
+              <w:t xml:space="preserve">sim-ii/ajax/ajaxGetEventsLog.php</w:t>
+            </w:r>
+          </w:p>
+        </w:tc>
+      </w:tr>
+      <w:tr>
+        <w:trPr>
+          <w:cantSplit/>
+        </w:trPr>
+        <w:tc>
+          <w:tcPr>
+            <w:tcW w:type="dxa" w:w="2500"/>
+            <w:tcBorders>
+              <w:top w:val="single" w:color="CCCCCC" w:sz="1"/>
+              <w:left w:val="single" w:color="CCCCCC" w:sz="1"/>
+              <w:bottom w:val="single" w:color="CCCCCC" w:sz="1"/>
+              <w:right w:val="single" w:color="CCCCCC" w:sz="1"/>
+            </w:tcBorders>
+            <w:shd w:fill="EBF3FB" w:val="clear"/>
+            <w:tcMar>
+              <w:top w:type="dxa" w:w="80"/>
+              <w:left w:type="dxa" w:w="120"/>
+              <w:bottom w:type="dxa" w:w="80"/>
+              <w:right w:type="dxa" w:w="120"/>
+            </w:tcMar>
+          </w:tcPr>
+          <w:p>
+            <w:r>
+              <w:rPr>
+                <w:b/>
+                <w:bCs/>
+                <w:sz w:val="20"/>
+                <w:szCs w:val="20"/>
+              </w:rPr>
+              <w:t xml:space="preserve">Change 16</w:t>
+            </w:r>
+          </w:p>
+        </w:tc>
+        <w:tc>
+          <w:tcPr>
+            <w:tcW w:type="dxa" w:w="6860"/>
+            <w:tcBorders>
+              <w:top w:val="single" w:color="CCCCCC" w:sz="1"/>
+              <w:left w:val="single" w:color="CCCCCC" w:sz="1"/>
+              <w:bottom w:val="single" w:color="CCCCCC" w:sz="1"/>
+              <w:right w:val="single" w:color="CCCCCC" w:sz="1"/>
+            </w:tcBorders>
+            <w:tcMar>
+              <w:top w:type="dxa" w:w="80"/>
+              <w:left w:type="dxa" w:w="120"/>
+              <w:bottom w:type="dxa" w:w="80"/>
+              <w:right w:type="dxa" w:w="120"/>
+            </w:tcMar>
+          </w:tcPr>
+          <w:p>
+            <w:r>
+              <w:rPr>
+                <w:sz w:val="20"/>
+                <w:szCs w:val="20"/>
+              </w:rPr>
+              <w:t xml:space="preserve">Event-log endpoint hardened against a PHP 8 fatal</w:t>
+            </w:r>
+          </w:p>
+        </w:tc>
+      </w:tr>
+      <w:tr>
+        <w:trPr>
+          <w:cantSplit/>
+        </w:trPr>
+        <w:tc>
+          <w:tcPr>
+            <w:tcW w:type="dxa" w:w="2500"/>
+            <w:tcBorders>
+              <w:top w:val="single" w:color="CCCCCC" w:sz="1"/>
+              <w:left w:val="single" w:color="CCCCCC" w:sz="1"/>
+              <w:bottom w:val="single" w:color="CCCCCC" w:sz="1"/>
+              <w:right w:val="single" w:color="CCCCCC" w:sz="1"/>
+            </w:tcBorders>
+            <w:shd w:fill="D6E4F0" w:val="clear"/>
+            <w:tcMar>
+              <w:top w:type="dxa" w:w="80"/>
+              <w:left w:type="dxa" w:w="120"/>
+              <w:bottom w:type="dxa" w:w="80"/>
+              <w:right w:type="dxa" w:w="120"/>
+            </w:tcMar>
+          </w:tcPr>
+          <w:p>
+            <w:r>
+              <w:rPr>
+                <w:b/>
+                <w:bCs/>
+                <w:sz w:val="20"/>
+                <w:szCs w:val="20"/>
+              </w:rPr>
+              <w:t xml:space="preserve">File</w:t>
+            </w:r>
+          </w:p>
+        </w:tc>
+        <w:tc>
+          <w:tcPr>
+            <w:tcW w:type="dxa" w:w="6860"/>
+            <w:tcBorders>
+              <w:top w:val="single" w:color="CCCCCC" w:sz="1"/>
+              <w:left w:val="single" w:color="CCCCCC" w:sz="1"/>
+              <w:bottom w:val="single" w:color="CCCCCC" w:sz="1"/>
+              <w:right w:val="single" w:color="CCCCCC" w:sz="1"/>
+            </w:tcBorders>
+            <w:tcMar>
+              <w:top w:type="dxa" w:w="80"/>
+              <w:left w:type="dxa" w:w="120"/>
+              <w:bottom w:type="dxa" w:w="80"/>
+              <w:right w:type="dxa" w:w="120"/>
+            </w:tcMar>
+          </w:tcPr>
+          <w:p>
+            <w:r>
+              <w:rPr>
+                <w:sz w:val="20"/>
+                <w:szCs w:val="20"/>
+              </w:rPr>
+              <w:t xml:space="preserve">OpenVetSim/keys.cpp</w:t>
+            </w:r>
+          </w:p>
+        </w:tc>
+      </w:tr>
+      <w:tr>
+        <w:trPr>
+          <w:cantSplit/>
+        </w:trPr>
+        <w:tc>
+          <w:tcPr>
+            <w:tcW w:type="dxa" w:w="2500"/>
+            <w:tcBorders>
+              <w:top w:val="single" w:color="CCCCCC" w:sz="1"/>
+              <w:left w:val="single" w:color="CCCCCC" w:sz="1"/>
+              <w:bottom w:val="single" w:color="CCCCCC" w:sz="1"/>
+              <w:right w:val="single" w:color="CCCCCC" w:sz="1"/>
+            </w:tcBorders>
+            <w:shd w:fill="EBF3FB" w:val="clear"/>
+            <w:tcMar>
+              <w:top w:type="dxa" w:w="80"/>
+              <w:left w:type="dxa" w:w="120"/>
+              <w:bottom w:type="dxa" w:w="80"/>
+              <w:right w:type="dxa" w:w="120"/>
+            </w:tcMar>
+          </w:tcPr>
+          <w:p>
+            <w:r>
+              <w:rPr>
+                <w:b/>
+                <w:bCs/>
+                <w:sz w:val="20"/>
+                <w:szCs w:val="20"/>
+              </w:rPr>
+              <w:t xml:space="preserve">Change 17</w:t>
+            </w:r>
+          </w:p>
+        </w:tc>
+        <w:tc>
+          <w:tcPr>
+            <w:tcW w:type="dxa" w:w="6860"/>
+            <w:tcBorders>
+              <w:top w:val="single" w:color="CCCCCC" w:sz="1"/>
+              <w:left w:val="single" w:color="CCCCCC" w:sz="1"/>
+              <w:bottom w:val="single" w:color="CCCCCC" w:sz="1"/>
+              <w:right w:val="single" w:color="CCCCCC" w:sz="1"/>
+            </w:tcBorders>
+            <w:tcMar>
+              <w:top w:type="dxa" w:w="80"/>
+              <w:left w:type="dxa" w:w="120"/>
+              <w:bottom w:type="dxa" w:w="80"/>
+              <w:right w:type="dxa" w:w="120"/>
+            </w:tcMar>
+          </w:tcPr>
+          <w:p>
+            <w:r>
+              <w:rPr>
+                <w:sz w:val="20"/>
+                <w:szCs w:val="20"/>
+              </w:rPr>
+              <w:t xml:space="preserve">Stale loopback serverAddress in winvetsim.ini self-heals to 0.0.0.0</w:t>
+            </w:r>
+          </w:p>
+        </w:tc>
+      </w:tr>
+      <w:tr>
+        <w:trPr>
+          <w:cantSplit/>
+        </w:trPr>
+        <w:tc>
+          <w:tcPr>
+            <w:tcW w:type="dxa" w:w="2500"/>
+            <w:tcBorders>
+              <w:top w:val="single" w:color="CCCCCC" w:sz="1"/>
+              <w:left w:val="single" w:color="CCCCCC" w:sz="1"/>
+              <w:bottom w:val="single" w:color="CCCCCC" w:sz="1"/>
+              <w:right w:val="single" w:color="CCCCCC" w:sz="1"/>
+            </w:tcBorders>
+            <w:shd w:fill="D6E4F0" w:val="clear"/>
+            <w:tcMar>
+              <w:top w:type="dxa" w:w="80"/>
+              <w:left w:type="dxa" w:w="120"/>
+              <w:bottom w:type="dxa" w:w="80"/>
+              <w:right w:type="dxa" w:w="120"/>
+            </w:tcMar>
+          </w:tcPr>
+          <w:p>
+            <w:r>
+              <w:rPr>
+                <w:b/>
+                <w:bCs/>
+                <w:sz w:val="20"/>
+                <w:szCs w:val="20"/>
+              </w:rPr>
+              <w:t xml:space="preserve">File</w:t>
+            </w:r>
+          </w:p>
+        </w:tc>
+        <w:tc>
+          <w:tcPr>
+            <w:tcW w:type="dxa" w:w="6860"/>
+            <w:tcBorders>
+              <w:top w:val="single" w:color="CCCCCC" w:sz="1"/>
+              <w:left w:val="single" w:color="CCCCCC" w:sz="1"/>
+              <w:bottom w:val="single" w:color="CCCCCC" w:sz="1"/>
+              <w:right w:val="single" w:color="CCCCCC" w:sz="1"/>
+            </w:tcBorders>
+            <w:tcMar>
+              <w:top w:type="dxa" w:w="80"/>
+              <w:left w:type="dxa" w:w="120"/>
+              <w:bottom w:type="dxa" w:w="80"/>
+              <w:right w:type="dxa" w:w="120"/>
+            </w:tcMar>
+          </w:tcPr>
+          <w:p>
+            <w:r>
+              <w:rPr>
+                <w:sz w:val="20"/>
+                <w:szCs w:val="20"/>
+              </w:rPr>
+              <w:t xml:space="preserve">OpenVetSim-App/build/installer.nsh</w:t>
+            </w:r>
+          </w:p>
+        </w:tc>
+      </w:tr>
+      <w:tr>
+        <w:trPr>
+          <w:cantSplit/>
+        </w:trPr>
+        <w:tc>
+          <w:tcPr>
+            <w:tcW w:type="dxa" w:w="2500"/>
+            <w:tcBorders>
+              <w:top w:val="single" w:color="CCCCCC" w:sz="1"/>
+              <w:left w:val="single" w:color="CCCCCC" w:sz="1"/>
+              <w:bottom w:val="single" w:color="CCCCCC" w:sz="1"/>
+              <w:right w:val="single" w:color="CCCCCC" w:sz="1"/>
+            </w:tcBorders>
+            <w:shd w:fill="EBF3FB" w:val="clear"/>
+            <w:tcMar>
+              <w:top w:type="dxa" w:w="80"/>
+              <w:left w:type="dxa" w:w="120"/>
+              <w:bottom w:type="dxa" w:w="80"/>
+              <w:right w:type="dxa" w:w="120"/>
+            </w:tcMar>
+          </w:tcPr>
+          <w:p>
+            <w:r>
+              <w:rPr>
+                <w:b/>
+                <w:bCs/>
+                <w:sz w:val="20"/>
+                <w:szCs w:val="20"/>
+              </w:rPr>
+              <w:t xml:space="preserve">Change 18</w:t>
+            </w:r>
+          </w:p>
+        </w:tc>
+        <w:tc>
+          <w:tcPr>
+            <w:tcW w:type="dxa" w:w="6860"/>
+            <w:tcBorders>
+              <w:top w:val="single" w:color="CCCCCC" w:sz="1"/>
+              <w:left w:val="single" w:color="CCCCCC" w:sz="1"/>
+              <w:bottom w:val="single" w:color="CCCCCC" w:sz="1"/>
+              <w:right w:val="single" w:color="CCCCCC" w:sz="1"/>
+            </w:tcBorders>
+            <w:tcMar>
+              <w:top w:type="dxa" w:w="80"/>
+              <w:left w:type="dxa" w:w="120"/>
+              <w:bottom w:type="dxa" w:w="80"/>
+              <w:right w:type="dxa" w:w="120"/>
+            </w:tcMar>
+          </w:tcPr>
+          <w:p>
+            <w:r>
+              <w:rPr>
+                <w:sz w:val="20"/>
+                <w:szCs w:val="20"/>
+              </w:rPr>
+              <w:t xml:space="preserve">Uninstaller no longer prompts to delete (or deletes) user scenarios and recordings</w:t>
+            </w:r>
+          </w:p>
+        </w:tc>
+      </w:tr>
     </w:tbl>
     <w:p>
       <w:pPr>
@@ -4030,6 +4870,418 @@
     <w:p>
       <w:r>
         <w:t xml:space="preserve">If arrival and play track each other, the controller is reproducing what it receives and any remaining irregularity originated upstream — in the network or in the simulator. If they diverge, the delay is being introduced on the controller. This separation is what located the fault.</w:t>
+      </w:r>
+    </w:p>
+    <w:p>
+      <w:pPr>
+        <w:pStyle w:val="Heading1"/>
+      </w:pPr>
+      <w:r>
+        <w:t xml:space="preserve">12. Scenario-Load Error Handling</w:t>
+      </w:r>
+    </w:p>
+    <w:p>
+      <w:pPr>
+        <w:pStyle w:val="Heading2"/>
+      </w:pPr>
+      <w:r>
+        <w:t xml:space="preserve">Files: sim-ii/includes/classes/scenarioXML.class.php (and sim-player copy)  |  ajax/ajaxGetScenario.php  |  js/scenario.js  |  js/profile.js</w:t>
+      </w:r>
+    </w:p>
+    <w:p>
+      <w:pPr>
+        <w:spacing w:after="120"/>
+      </w:pPr>
+      <w:r>
+        <w:rPr>
+          <w:b/>
+          <w:bCs/>
+        </w:rPr>
+        <w:t xml:space="preserve">Problem</w:t>
+      </w:r>
+    </w:p>
+    <w:p>
+      <w:pPr>
+        <w:spacing w:after="120"/>
+      </w:pPr>
+      <w:r>
+        <w:t xml:space="preserve">An empty &lt;vocals&gt; or &lt;media&gt; element in a scenario made getScenarioVocalsArray()/getScenarioMediaArray() return FALSE, which aborted the entire scenario load in ajaxGetScenario.php. Because libxml errors were suppressed and the JS ignored the failure status, the instructor saw no error at all — patient information and priority-1 events simply never appeared.</w:t>
+      </w:r>
+    </w:p>
+    <w:p>
+      <w:pPr>
+        <w:spacing w:after="120"/>
+      </w:pPr>
+      <w:r>
+        <w:rPr>
+          <w:b/>
+          <w:bCs/>
+        </w:rPr>
+        <w:t xml:space="preserve">Fix</w:t>
+      </w:r>
+    </w:p>
+    <w:p>
+      <w:pPr>
+        <w:spacing w:after="120"/>
+      </w:pPr>
+      <w:r>
+        <w:t xml:space="preserve">scenarioXML.class.php now captures libxml_get_errors() (line and column) into a static $lastError, and treats an empty or absent &lt;vocals&gt;/&lt;media&gt; section as valid, returning an empty list instead of a fatal FALSE. ajaxGetScenario.php returns the specific cause on failure. scenario.js shows a modal popup when a load fails, skips loading when no scenario is selected, and resets the scenario fields to undefined so the downstream init guards behave. profile.init() now guards on the controls data it actually uses rather than only testing for 'undefined'.</w:t>
+      </w:r>
+    </w:p>
+    <w:p>
+      <w:pPr>
+        <w:pStyle w:val="Heading1"/>
+      </w:pPr>
+      <w:r>
+        <w:t xml:space="preserve">13. Engine Version 2.6.2 &amp; About Box</w:t>
+      </w:r>
+    </w:p>
+    <w:p>
+      <w:pPr>
+        <w:pStyle w:val="Heading2"/>
+      </w:pPr>
+      <w:r>
+        <w:t xml:space="preserve">Files: OpenVetSim/version.h  |  main.cpp  |  sim-ii/js/modal.js</w:t>
+      </w:r>
+    </w:p>
+    <w:p>
+      <w:pPr>
+        <w:spacing w:after="120"/>
+      </w:pPr>
+      <w:r>
+        <w:rPr>
+          <w:b/>
+          <w:bCs/>
+        </w:rPr>
+        <w:t xml:space="preserve">Overview</w:t>
+      </w:r>
+    </w:p>
+    <w:p>
+      <w:pPr>
+        <w:spacing w:after="120"/>
+      </w:pPr>
+      <w:r>
+        <w:t xml:space="preserve">The engine reported its internal version as 2.5.x while the product was 2.6.2, and the About box still showed obsolete release lines.</w:t>
+      </w:r>
+    </w:p>
+    <w:p>
+      <w:pPr>
+        <w:spacing w:after="120"/>
+      </w:pPr>
+      <w:r>
+        <w:rPr>
+          <w:b/>
+          <w:bCs/>
+        </w:rPr>
+        <w:t xml:space="preserve">Fix</w:t>
+      </w:r>
+    </w:p>
+    <w:p>
+      <w:pPr>
+        <w:spacing w:after="120"/>
+      </w:pPr>
+      <w:r>
+        <w:t xml:space="preserve">version.h: SIMMGR_VERSION_MIN raised 5 → 6 and a new SIMMGR_VERSION_PATCH 2 added. main.cpp: setWVSVersion() now builds the string as MAJ.MIN.PATCH ("2.6.2") instead of MAJ.MIN.&lt;buildDate&gt;; the build date is still written to the log. modal.js: the About box now reads "About OpenVetSim" and "Release 2.6.2", and the stale "Instructor Interface Release" and "Win Vet Sim Release" lines were removed.</w:t>
+      </w:r>
+    </w:p>
+    <w:p>
+      <w:pPr>
+        <w:pStyle w:val="Heading1"/>
+      </w:pPr>
+      <w:r>
+        <w:t xml:space="preserve">14. Windows Startup Crash Fix</w:t>
+      </w:r>
+    </w:p>
+    <w:p>
+      <w:pPr>
+        <w:pStyle w:val="Heading2"/>
+      </w:pPr>
+      <w:r>
+        <w:t xml:space="preserve">Files: OpenVetSim/WebSrv.cpp  |  VetSim.cpp  |  Function: startPHPServer()</w:t>
+      </w:r>
+    </w:p>
+    <w:p>
+      <w:pPr>
+        <w:spacing w:after="120"/>
+      </w:pPr>
+      <w:r>
+        <w:rPr>
+          <w:b/>
+          <w:bCs/>
+        </w:rPr>
+        <w:t xml:space="preserve">Problem</w:t>
+      </w:r>
+    </w:p>
+    <w:p>
+      <w:pPr>
+        <w:spacing w:after="120"/>
+      </w:pPr>
+      <w:r>
+        <w:t xml:space="preserve">On any machine whose winvetsim.ini pinned serverAddress to 127.0.0.1, the engine terminated immediately after logging "starting PHP" and the Electron window went blank (about:blank). It affected the lab PC every launch but not the developer PC.</w:t>
+      </w:r>
+    </w:p>
+    <w:p>
+      <w:pPr>
+        <w:spacing w:after="120"/>
+      </w:pPr>
+      <w:r>
+        <w:rPr>
+          <w:b/>
+          <w:bCs/>
+        </w:rPr>
+        <w:t xml:space="preserve">Root cause</w:t>
+      </w:r>
+    </w:p>
+    <w:p>
+      <w:pPr>
+        <w:spacing w:after="120"/>
+      </w:pPr>
+      <w:r>
+        <w:t xml:space="preserve">The "PHP bound to loopback" warning — new in 2.6.2 — formats a ~330-byte message into a 300-byte buffer with sprintf_s, which aborts the process on overflow. That branch only runs when PHP is bound to 127.0.0.1, i.e. exactly the stale-ini condition, so affected machines crashed on every launch while machines bound to 0.0.0.0 never hit it. A secondary factor: the PHP-readiness health check waited only ~1 second (shortened further by the 2.6.2 timeBeginPeriod(1) call) and treated a timeout as fatal.</w:t>
+      </w:r>
+    </w:p>
+    <w:p>
+      <w:pPr>
+        <w:spacing w:after="120"/>
+      </w:pPr>
+      <w:r>
+        <w:rPr>
+          <w:b/>
+          <w:bCs/>
+        </w:rPr>
+        <w:t xml:space="preserve">Fix</w:t>
+      </w:r>
+    </w:p>
+    <w:p>
+      <w:pPr>
+        <w:spacing w:after="120"/>
+      </w:pPr>
+      <w:r>
+        <w:t xml:space="preserve">WebSrv.cpp: the message buffer was enlarged to 2300 bytes (also covering "starting PHP: &lt;commandLine&gt;", where commandLine is 2048), and the PHP readiness poll was widened from ~1 s to 30 s. VetSim.cpp: a failed health check is now non-fatal — PHP is already launched and the Electron launcher verifies it before the UI is shown, so the engine no longer exits over a slow check.</w:t>
+      </w:r>
+    </w:p>
+    <w:p>
+      <w:pPr>
+        <w:pStyle w:val="Heading1"/>
+      </w:pPr>
+      <w:r>
+        <w:t xml:space="preserve">15. Controller-Connection Hardening</w:t>
+      </w:r>
+    </w:p>
+    <w:p>
+      <w:pPr>
+        <w:pStyle w:val="Heading2"/>
+      </w:pPr>
+      <w:r>
+        <w:t xml:space="preserve">File: OpenVetSim/pulse.cpp  |  Functions: pulseTask(), getControllerVersion(), ReadWebPage()</w:t>
+      </w:r>
+    </w:p>
+    <w:p>
+      <w:pPr>
+        <w:spacing w:after="120"/>
+      </w:pPr>
+      <w:r>
+        <w:rPr>
+          <w:b/>
+          <w:bCs/>
+        </w:rPr>
+        <w:t xml:space="preserve">Problem</w:t>
+      </w:r>
+    </w:p>
+    <w:p>
+      <w:pPr>
+        <w:spacing w:after="120"/>
+      </w:pPr>
+      <w:r>
+        <w:t xml:space="preserve">With a hardware controller attached, two 2.6.2 behaviors could destabilize the engine. The legacy pulse port 50200 (bound alongside 40844) triggered a rapid connect/refuse storm with controllers that scan both ports. Separately, getControllerVersion() fetched the controller's firmware version over HTTP synchronously on the accept path, with no timeout, so a controller that did not answer on port 80 could stall the pulse loop.</w:t>
+      </w:r>
+    </w:p>
+    <w:p>
+      <w:pPr>
+        <w:spacing w:after="120"/>
+      </w:pPr>
+      <w:r>
+        <w:rPr>
+          <w:b/>
+          <w:bCs/>
+        </w:rPr>
+        <w:t xml:space="preserve">Fix</w:t>
+      </w:r>
+    </w:p>
+    <w:p>
+      <w:pPr>
+        <w:spacing w:after="120"/>
+      </w:pPr>
+      <w:r>
+        <w:t xml:space="preserve">The legacy port 50200 is now disabled by default (gated behind enableLegacyPulsePort), restoring 2.6.1 behavior — controllers connect on 40844 as before. ReadWebPage() sets 2-second WinHTTP timeouts, and getControllerVersion() runs on a detached thread, off the accept path, so a slow or unreachable controller can no longer stall or crash the engine.</w:t>
+      </w:r>
+    </w:p>
+    <w:p>
+      <w:pPr>
+        <w:pStyle w:val="Heading1"/>
+      </w:pPr>
+      <w:r>
+        <w:t xml:space="preserve">16. Event-Log Endpoint PHP 8 Fix</w:t>
+      </w:r>
+    </w:p>
+    <w:p>
+      <w:pPr>
+        <w:pStyle w:val="Heading2"/>
+      </w:pPr>
+      <w:r>
+        <w:t xml:space="preserve">File: sim-ii/ajax/ajaxGetEventsLog.php</w:t>
+      </w:r>
+    </w:p>
+    <w:p>
+      <w:pPr>
+        <w:spacing w:after="120"/>
+      </w:pPr>
+      <w:r>
+        <w:rPr>
+          <w:b/>
+          <w:bCs/>
+        </w:rPr>
+        <w:t xml:space="preserve">Problem</w:t>
+      </w:r>
+    </w:p>
+    <w:p>
+      <w:pPr>
+        <w:spacing w:after="120"/>
+      </w:pPr>
+      <w:r>
+        <w:t xml:space="preserve">file() returns FALSE when the sim log cannot be read — on Windows the engine holds the log open for writing. In PHP 8, array_reverse(FALSE) is a fatal TypeError (it was only a warning in PHP 7), so the endpoint crashed on the PHP 8 runtime and flooded the log.</w:t>
+      </w:r>
+    </w:p>
+    <w:p>
+      <w:pPr>
+        <w:spacing w:after="120"/>
+      </w:pPr>
+      <w:r>
+        <w:rPr>
+          <w:b/>
+          <w:bCs/>
+        </w:rPr>
+        <w:t xml:space="preserve">Fix</w:t>
+      </w:r>
+    </w:p>
+    <w:p>
+      <w:pPr>
+        <w:spacing w:after="120"/>
+      </w:pPr>
+      <w:r>
+        <w:t xml:space="preserve">Guard the file() result: if it returns FALSE, return a clean AJAX_STATUS_FAIL instead of passing a boolean to array_reverse().</w:t>
+      </w:r>
+    </w:p>
+    <w:p>
+      <w:pPr>
+        <w:pStyle w:val="Heading1"/>
+      </w:pPr>
+      <w:r>
+        <w:t xml:space="preserve">17. Self-Healing Loopback serverAddress</w:t>
+      </w:r>
+    </w:p>
+    <w:p>
+      <w:pPr>
+        <w:pStyle w:val="Heading2"/>
+      </w:pPr>
+      <w:r>
+        <w:t xml:space="preserve">File: OpenVetSim/keys.cpp  |  Function: getKeys()</w:t>
+      </w:r>
+    </w:p>
+    <w:p>
+      <w:pPr>
+        <w:spacing w:after="120"/>
+      </w:pPr>
+      <w:r>
+        <w:rPr>
+          <w:b/>
+          <w:bCs/>
+        </w:rPr>
+        <w:t xml:space="preserve">Problem</w:t>
+      </w:r>
+    </w:p>
+    <w:p>
+      <w:pPr>
+        <w:spacing w:after="120"/>
+      </w:pPr>
+      <w:r>
+        <w:t xml:space="preserve">winvetsim.ini lives in the user data directory and is never rewritten by any installer, so installs first created when the compiled default was 127.0.0.1 keep binding PHP to loopback across every upgrade — silently disabling sim-remote and remote instructor access.</w:t>
+      </w:r>
+    </w:p>
+    <w:p>
+      <w:pPr>
+        <w:spacing w:after="120"/>
+      </w:pPr>
+      <w:r>
+        <w:rPr>
+          <w:b/>
+          <w:bCs/>
+        </w:rPr>
+        <w:t xml:space="preserve">Fix</w:t>
+      </w:r>
+    </w:p>
+    <w:p>
+      <w:pPr>
+        <w:spacing w:after="120"/>
+      </w:pPr>
+      <w:r>
+        <w:t xml:space="preserve">On startup, if no loopbackMigrated marker is present and serverAddress is 127.0.0.1 or localhost, the engine rewrites it to 0.0.0.0 once and stamps the marker. The migration is one-time and reversible: an administrator who genuinely wants loopback-only can set serverAddress back to 127.0.0.1 and, because the marker is present, that choice is respected on every future launch. Fresh installs are created at 0.0.0.0 and simply get the marker stamped.</w:t>
+      </w:r>
+    </w:p>
+    <w:p>
+      <w:pPr>
+        <w:pStyle w:val="Heading1"/>
+      </w:pPr>
+      <w:r>
+        <w:t xml:space="preserve">18. Installer: Preserve User Scenarios on Uninstall</w:t>
+      </w:r>
+    </w:p>
+    <w:p>
+      <w:pPr>
+        <w:pStyle w:val="Heading2"/>
+      </w:pPr>
+      <w:r>
+        <w:t xml:space="preserve">File: OpenVetSim-App/build/installer.nsh  |  Macro: customUnInstall</w:t>
+      </w:r>
+    </w:p>
+    <w:p>
+      <w:pPr>
+        <w:spacing w:after="120"/>
+      </w:pPr>
+      <w:r>
+        <w:rPr>
+          <w:b/>
+          <w:bCs/>
+        </w:rPr>
+        <w:t xml:space="preserve">Problem</w:t>
+      </w:r>
+    </w:p>
+    <w:p>
+      <w:pPr>
+        <w:spacing w:after="120"/>
+      </w:pPr>
+      <w:r>
+        <w:t xml:space="preserve">On an upgrade, electron-builder runs the previous version's uninstaller automatically, whose customUnInstall macro asked "Also delete your simulation scenarios and session recordings?" — appearing as a confusing second scenario dialog on top of the install-time backup prompt.</w:t>
+      </w:r>
+    </w:p>
+    <w:p>
+      <w:pPr>
+        <w:spacing w:after="120"/>
+      </w:pPr>
+      <w:r>
+        <w:rPr>
+          <w:b/>
+          <w:bCs/>
+        </w:rPr>
+        <w:t xml:space="preserve">Fix</w:t>
+      </w:r>
+    </w:p>
+    <w:p>
+      <w:pPr>
+        <w:spacing w:after="120"/>
+      </w:pPr>
+      <w:r>
+        <w:t xml:space="preserve">The uninstaller now always leaves user data (scenarios and simlogs) in place and never prompts. The install-time timestamped backup remains the single scenario prompt. Anyone who truly wants the data removed can delete C:\Users\Public\OpenVetSim by hand.</w:t>
       </w:r>
     </w:p>
     <w:p/>

</xml_diff>